<commit_message>
Updating user guide with workflow for merging and deleting a feature branch
</commit_message>
<xml_diff>
--- a/Documentation/Developers_Guide.docx
+++ b/Documentation/Developers_Guide.docx
@@ -722,27 +722,7 @@
           <w:szCs w:val="20"/>
           <w:highlight w:val="lightGray"/>
         </w:rPr>
-        <w:t>git checkout &lt;</w:t>
-      </w:r>
-      <w:proofErr w:type="spellStart"/>
-      <w:r>
-        <w:rPr>
-          <w:rFonts w:ascii="Consolas" w:hAnsi="Consolas" w:cs="Consolas"/>
-          <w:sz w:val="20"/>
-          <w:szCs w:val="20"/>
-          <w:highlight w:val="lightGray"/>
-        </w:rPr>
-        <w:t>other_branch</w:t>
-      </w:r>
-      <w:proofErr w:type="spellEnd"/>
-      <w:r>
-        <w:rPr>
-          <w:rFonts w:ascii="Consolas" w:hAnsi="Consolas" w:cs="Consolas"/>
-          <w:sz w:val="20"/>
-          <w:szCs w:val="20"/>
-          <w:highlight w:val="lightGray"/>
-        </w:rPr>
-        <w:t>&gt;</w:t>
+        <w:t>git checkout &lt;other_branch&gt;</w:t>
       </w:r>
       <w:r>
         <w:rPr>
@@ -857,23 +837,7 @@
           <w:sz w:val="21"/>
           <w:szCs w:val="21"/>
         </w:rPr>
-        <w:t xml:space="preserve">You can restore your local feature branch to any of your commits </w:t>
-      </w:r>
-      <w:proofErr w:type="gramStart"/>
-      <w:r>
-        <w:rPr>
-          <w:sz w:val="21"/>
-          <w:szCs w:val="21"/>
-        </w:rPr>
-        <w:t>at a later time</w:t>
-      </w:r>
-      <w:proofErr w:type="gramEnd"/>
-      <w:r>
-        <w:rPr>
-          <w:sz w:val="21"/>
-          <w:szCs w:val="21"/>
-        </w:rPr>
-        <w:t xml:space="preserve">, so these are helpful when your code starts to break and you just want to reset to some previous point.  </w:t>
+        <w:t xml:space="preserve">You can restore your local feature branch to any of your commits at a later time, so these are helpful when your code starts to break and you just want to reset to some previous point.  </w:t>
       </w:r>
       <w:r>
         <w:rPr>
@@ -889,9 +853,15 @@
           <w:szCs w:val="20"/>
           <w:highlight w:val="lightGray"/>
         </w:rPr>
-        <w:t xml:space="preserve">git </w:t>
-      </w:r>
-      <w:proofErr w:type="gramStart"/>
+        <w:t>git add .</w:t>
+      </w:r>
+      <w:r>
+        <w:rPr>
+          <w:sz w:val="21"/>
+          <w:szCs w:val="21"/>
+        </w:rPr>
+        <w:t>”, then make the commit with “</w:t>
+      </w:r>
       <w:r>
         <w:rPr>
           <w:rFonts w:ascii="Consolas" w:hAnsi="Consolas" w:cs="Consolas"/>
@@ -899,15 +869,114 @@
           <w:szCs w:val="20"/>
           <w:highlight w:val="lightGray"/>
         </w:rPr>
-        <w:t>add .</w:t>
-      </w:r>
-      <w:proofErr w:type="gramEnd"/>
+        <w:t>git commit -m “descriptive message goes here</w:t>
+      </w:r>
       <w:r>
         <w:rPr>
           <w:sz w:val="21"/>
           <w:szCs w:val="21"/>
         </w:rPr>
-        <w:t>”, then make the commit with “</w:t>
+        <w:t xml:space="preserve">”. </w:t>
+      </w:r>
+    </w:p>
+    <w:p>
+      <w:pPr>
+        <w:jc w:val="both"/>
+        <w:rPr>
+          <w:sz w:val="21"/>
+          <w:szCs w:val="21"/>
+        </w:rPr>
+      </w:pPr>
+      <w:r>
+        <w:rPr>
+          <w:sz w:val="21"/>
+          <w:szCs w:val="21"/>
+        </w:rPr>
+        <w:t>Push: Send</w:t>
+      </w:r>
+      <w:r>
+        <w:rPr>
+          <w:sz w:val="21"/>
+          <w:szCs w:val="21"/>
+        </w:rPr>
+        <w:t>s your</w:t>
+      </w:r>
+      <w:r>
+        <w:rPr>
+          <w:sz w:val="21"/>
+          <w:szCs w:val="21"/>
+        </w:rPr>
+        <w:t xml:space="preserve"> local commits</w:t>
+      </w:r>
+      <w:r>
+        <w:rPr>
+          <w:sz w:val="21"/>
+          <w:szCs w:val="21"/>
+        </w:rPr>
+        <w:t xml:space="preserve"> made to a </w:t>
+      </w:r>
+      <w:r>
+        <w:rPr>
+          <w:sz w:val="21"/>
+          <w:szCs w:val="21"/>
+        </w:rPr>
+        <w:t xml:space="preserve">feature </w:t>
+      </w:r>
+      <w:r>
+        <w:rPr>
+          <w:sz w:val="21"/>
+          <w:szCs w:val="21"/>
+        </w:rPr>
+        <w:t>branch on your computer back</w:t>
+      </w:r>
+      <w:r>
+        <w:rPr>
+          <w:sz w:val="21"/>
+          <w:szCs w:val="21"/>
+        </w:rPr>
+        <w:t xml:space="preserve"> to </w:t>
+      </w:r>
+      <w:r>
+        <w:rPr>
+          <w:sz w:val="21"/>
+          <w:szCs w:val="21"/>
+        </w:rPr>
+        <w:t xml:space="preserve">the remote repository on </w:t>
+      </w:r>
+      <w:r>
+        <w:rPr>
+          <w:sz w:val="21"/>
+          <w:szCs w:val="21"/>
+        </w:rPr>
+        <w:t>GitLab.</w:t>
+      </w:r>
+      <w:r>
+        <w:rPr>
+          <w:sz w:val="21"/>
+          <w:szCs w:val="21"/>
+        </w:rPr>
+        <w:t xml:space="preserve"> This makes the feature branch of the remote repository match the feature branch in the local repository. </w:t>
+      </w:r>
+      <w:r>
+        <w:rPr>
+          <w:sz w:val="21"/>
+          <w:szCs w:val="21"/>
+        </w:rPr>
+        <w:t xml:space="preserve">If this is the first push, then the feature branch will be created on the remote repository automatically. </w:t>
+      </w:r>
+      <w:r>
+        <w:rPr>
+          <w:sz w:val="21"/>
+          <w:szCs w:val="21"/>
+        </w:rPr>
+        <w:t xml:space="preserve">Note: If conflicts exist between the local and remote branch, GitLab will ask to resolve these manually. </w:t>
+      </w:r>
+      <w:r>
+        <w:rPr>
+          <w:sz w:val="21"/>
+          <w:szCs w:val="21"/>
+        </w:rPr>
+        <w:t>Perform push with “</w:t>
       </w:r>
       <w:r>
         <w:rPr>
@@ -916,14 +985,14 @@
           <w:szCs w:val="20"/>
           <w:highlight w:val="lightGray"/>
         </w:rPr>
-        <w:t>git commit -m “descriptive message goes here</w:t>
+        <w:t>git push origin &lt;feature_branch_name&gt;</w:t>
       </w:r>
       <w:r>
         <w:rPr>
           <w:sz w:val="21"/>
           <w:szCs w:val="21"/>
         </w:rPr>
-        <w:t xml:space="preserve">”. </w:t>
+        <w:t>”.</w:t>
       </w:r>
     </w:p>
     <w:p>
@@ -939,91 +1008,77 @@
           <w:sz w:val="21"/>
           <w:szCs w:val="21"/>
         </w:rPr>
-        <w:t>Push: Send</w:t>
+        <w:t xml:space="preserve">Pull: Retrieve updates </w:t>
       </w:r>
       <w:r>
         <w:rPr>
           <w:sz w:val="21"/>
           <w:szCs w:val="21"/>
         </w:rPr>
-        <w:t>s your</w:t>
+        <w:t xml:space="preserve">of a branch </w:t>
       </w:r>
       <w:r>
         <w:rPr>
           <w:sz w:val="21"/>
           <w:szCs w:val="21"/>
         </w:rPr>
-        <w:t xml:space="preserve"> local commits</w:t>
+        <w:t>from</w:t>
       </w:r>
       <w:r>
         <w:rPr>
           <w:sz w:val="21"/>
           <w:szCs w:val="21"/>
         </w:rPr>
-        <w:t xml:space="preserve"> made to a </w:t>
+        <w:t xml:space="preserve"> the remote repository on</w:t>
       </w:r>
       <w:r>
         <w:rPr>
           <w:sz w:val="21"/>
           <w:szCs w:val="21"/>
         </w:rPr>
-        <w:t xml:space="preserve">feature </w:t>
+        <w:t xml:space="preserve"> GitLab</w:t>
       </w:r>
       <w:r>
         <w:rPr>
           <w:sz w:val="21"/>
           <w:szCs w:val="21"/>
         </w:rPr>
-        <w:t>branch on your computer back</w:t>
+        <w:t xml:space="preserve"> and merge them with the branch on your local repository</w:t>
       </w:r>
       <w:r>
         <w:rPr>
           <w:sz w:val="21"/>
           <w:szCs w:val="21"/>
         </w:rPr>
-        <w:t xml:space="preserve"> to </w:t>
+        <w:t>.</w:t>
       </w:r>
       <w:r>
         <w:rPr>
           <w:sz w:val="21"/>
           <w:szCs w:val="21"/>
         </w:rPr>
-        <w:t xml:space="preserve">the remote repository on </w:t>
+        <w:t xml:space="preserve"> This makes the branch</w:t>
       </w:r>
       <w:r>
         <w:rPr>
           <w:sz w:val="21"/>
           <w:szCs w:val="21"/>
         </w:rPr>
-        <w:t>GitLab.</w:t>
+        <w:t xml:space="preserve"> (“main” or a feature branch)</w:t>
       </w:r>
       <w:r>
         <w:rPr>
           <w:sz w:val="21"/>
           <w:szCs w:val="21"/>
         </w:rPr>
-        <w:t xml:space="preserve"> This makes the feature branch of the remote repository match the feature branch in the local repository. </w:t>
+        <w:t xml:space="preserve"> of the local repository match the branch in the remote repository. Note: If conflicts exist between the local and remote branch, GitLab will ask to resolve these manually. </w:t>
       </w:r>
       <w:r>
         <w:rPr>
           <w:sz w:val="21"/>
           <w:szCs w:val="21"/>
         </w:rPr>
-        <w:t xml:space="preserve">If this is the first push, then the feature branch will be created on the remote repository automatically. </w:t>
-      </w:r>
-      <w:r>
-        <w:rPr>
-          <w:sz w:val="21"/>
-          <w:szCs w:val="21"/>
-        </w:rPr>
-        <w:t xml:space="preserve">Note: If conflicts exist between the local and remote branch, GitLab will ask to resolve these manually. </w:t>
-      </w:r>
-      <w:r>
-        <w:rPr>
-          <w:sz w:val="21"/>
-          <w:szCs w:val="21"/>
-        </w:rPr>
-        <w:t>Perform push with “</w:t>
+        <w:t>Perform pull with “</w:t>
       </w:r>
       <w:r>
         <w:rPr>
@@ -1032,149 +1087,7 @@
           <w:szCs w:val="20"/>
           <w:highlight w:val="lightGray"/>
         </w:rPr>
-        <w:t>git push origin &lt;</w:t>
-      </w:r>
-      <w:proofErr w:type="spellStart"/>
-      <w:r>
-        <w:rPr>
-          <w:rFonts w:ascii="Consolas" w:hAnsi="Consolas" w:cs="Consolas"/>
-          <w:sz w:val="20"/>
-          <w:szCs w:val="20"/>
-          <w:highlight w:val="lightGray"/>
-        </w:rPr>
-        <w:t>feature_branch_name</w:t>
-      </w:r>
-      <w:proofErr w:type="spellEnd"/>
-      <w:r>
-        <w:rPr>
-          <w:rFonts w:ascii="Consolas" w:hAnsi="Consolas" w:cs="Consolas"/>
-          <w:sz w:val="20"/>
-          <w:szCs w:val="20"/>
-          <w:highlight w:val="lightGray"/>
-        </w:rPr>
-        <w:t>&gt;</w:t>
-      </w:r>
-      <w:r>
-        <w:rPr>
-          <w:sz w:val="21"/>
-          <w:szCs w:val="21"/>
-        </w:rPr>
-        <w:t>”.</w:t>
-      </w:r>
-    </w:p>
-    <w:p>
-      <w:pPr>
-        <w:jc w:val="both"/>
-        <w:rPr>
-          <w:sz w:val="21"/>
-          <w:szCs w:val="21"/>
-        </w:rPr>
-      </w:pPr>
-      <w:r>
-        <w:rPr>
-          <w:sz w:val="21"/>
-          <w:szCs w:val="21"/>
-        </w:rPr>
-        <w:t xml:space="preserve">Pull: Retrieve updates </w:t>
-      </w:r>
-      <w:r>
-        <w:rPr>
-          <w:sz w:val="21"/>
-          <w:szCs w:val="21"/>
-        </w:rPr>
-        <w:t xml:space="preserve">of a branch </w:t>
-      </w:r>
-      <w:r>
-        <w:rPr>
-          <w:sz w:val="21"/>
-          <w:szCs w:val="21"/>
-        </w:rPr>
-        <w:t>from</w:t>
-      </w:r>
-      <w:r>
-        <w:rPr>
-          <w:sz w:val="21"/>
-          <w:szCs w:val="21"/>
-        </w:rPr>
-        <w:t xml:space="preserve"> the remote repository on</w:t>
-      </w:r>
-      <w:r>
-        <w:rPr>
-          <w:sz w:val="21"/>
-          <w:szCs w:val="21"/>
-        </w:rPr>
-        <w:t xml:space="preserve"> GitLab</w:t>
-      </w:r>
-      <w:r>
-        <w:rPr>
-          <w:sz w:val="21"/>
-          <w:szCs w:val="21"/>
-        </w:rPr>
-        <w:t xml:space="preserve"> and merge them with the branch on your local repository</w:t>
-      </w:r>
-      <w:r>
-        <w:rPr>
-          <w:sz w:val="21"/>
-          <w:szCs w:val="21"/>
-        </w:rPr>
-        <w:t>.</w:t>
-      </w:r>
-      <w:r>
-        <w:rPr>
-          <w:sz w:val="21"/>
-          <w:szCs w:val="21"/>
-        </w:rPr>
-        <w:t xml:space="preserve"> This makes the branch</w:t>
-      </w:r>
-      <w:r>
-        <w:rPr>
-          <w:sz w:val="21"/>
-          <w:szCs w:val="21"/>
-        </w:rPr>
-        <w:t xml:space="preserve"> (“main” or a feature branch)</w:t>
-      </w:r>
-      <w:r>
-        <w:rPr>
-          <w:sz w:val="21"/>
-          <w:szCs w:val="21"/>
-        </w:rPr>
-        <w:t xml:space="preserve"> of the local repository match the branch in the remote repository. Note: If conflicts exist between the local and remote branch, GitLab will ask to resolve these manually. </w:t>
-      </w:r>
-      <w:r>
-        <w:rPr>
-          <w:sz w:val="21"/>
-          <w:szCs w:val="21"/>
-        </w:rPr>
-        <w:t>Perform pull with “</w:t>
-      </w:r>
-      <w:r>
-        <w:rPr>
-          <w:rFonts w:ascii="Consolas" w:hAnsi="Consolas" w:cs="Consolas"/>
-          <w:sz w:val="20"/>
-          <w:szCs w:val="20"/>
-          <w:highlight w:val="lightGray"/>
-        </w:rPr>
-        <w:t>git pull origin &lt;</w:t>
-      </w:r>
-      <w:proofErr w:type="spellStart"/>
-      <w:r>
-        <w:rPr>
-          <w:rFonts w:ascii="Consolas" w:hAnsi="Consolas" w:cs="Consolas"/>
-          <w:sz w:val="20"/>
-          <w:szCs w:val="20"/>
-          <w:highlight w:val="lightGray"/>
-        </w:rPr>
-        <w:t>branch_name</w:t>
-      </w:r>
-      <w:proofErr w:type="spellEnd"/>
-      <w:r>
-        <w:rPr>
-          <w:rFonts w:ascii="Consolas" w:hAnsi="Consolas" w:cs="Consolas"/>
-          <w:sz w:val="20"/>
-          <w:szCs w:val="20"/>
-          <w:highlight w:val="lightGray"/>
-        </w:rPr>
-        <w:t>&gt;</w:t>
+        <w:t>git pull origin &lt;branch_name&gt;</w:t>
       </w:r>
       <w:r>
         <w:rPr>
@@ -2373,6 +2286,430 @@
     </w:p>
     <w:p>
       <w:pPr>
+        <w:pStyle w:val="ListParagraph"/>
+        <w:numPr>
+          <w:ilvl w:val="1"/>
+          <w:numId w:val="11"/>
+        </w:numPr>
+        <w:jc w:val="both"/>
+      </w:pPr>
+      <w:r>
+        <w:t xml:space="preserve">From the remote repo on GitLab.com, select the feature branch from the </w:t>
+      </w:r>
+      <w:r>
+        <w:t>drop-down</w:t>
+      </w:r>
+      <w:r>
+        <w:t xml:space="preserve"> menu. </w:t>
+      </w:r>
+    </w:p>
+    <w:p>
+      <w:pPr>
+        <w:pStyle w:val="ListParagraph"/>
+        <w:numPr>
+          <w:ilvl w:val="1"/>
+          <w:numId w:val="11"/>
+        </w:numPr>
+        <w:jc w:val="both"/>
+      </w:pPr>
+      <w:r>
+        <w:t xml:space="preserve">Click “create merge request” and fill in the form with a description for the merge request, assign a code maintainer to the request, and request review from a team member if desired. Select the “delete branch after merge” option, which will automatically delete </w:t>
+      </w:r>
+      <w:proofErr w:type="spellStart"/>
+      <w:r>
+        <w:rPr>
+          <w:rFonts w:ascii="Consolas" w:hAnsi="Consolas" w:cs="Consolas"/>
+          <w:sz w:val="20"/>
+          <w:szCs w:val="20"/>
+          <w:highlight w:val="lightGray"/>
+        </w:rPr>
+        <w:t>RelPerm_bug_</w:t>
+      </w:r>
+      <w:r>
+        <w:rPr>
+          <w:rFonts w:ascii="Consolas" w:hAnsi="Consolas" w:cs="Consolas"/>
+          <w:sz w:val="20"/>
+          <w:szCs w:val="20"/>
+          <w:highlight w:val="lightGray"/>
+        </w:rPr>
+        <w:t>fix</w:t>
+      </w:r>
+      <w:proofErr w:type="spellEnd"/>
+      <w:r>
+        <w:t xml:space="preserve"> branch</w:t>
+      </w:r>
+      <w:r>
+        <w:t xml:space="preserve"> after it is merged. </w:t>
+      </w:r>
+    </w:p>
+    <w:p>
+      <w:pPr>
+        <w:pStyle w:val="ListParagraph"/>
+        <w:numPr>
+          <w:ilvl w:val="1"/>
+          <w:numId w:val="11"/>
+        </w:numPr>
+        <w:jc w:val="both"/>
+      </w:pPr>
+      <w:r>
+        <w:t xml:space="preserve">A code maintainer can finalize the merge of </w:t>
+      </w:r>
+      <w:proofErr w:type="spellStart"/>
+      <w:r>
+        <w:rPr>
+          <w:rFonts w:ascii="Consolas" w:hAnsi="Consolas" w:cs="Consolas"/>
+          <w:sz w:val="20"/>
+          <w:szCs w:val="20"/>
+          <w:highlight w:val="lightGray"/>
+        </w:rPr>
+        <w:t>RelPerm_bug_fix</w:t>
+      </w:r>
+      <w:proofErr w:type="spellEnd"/>
+      <w:r>
+        <w:rPr>
+          <w:rFonts w:ascii="Consolas" w:hAnsi="Consolas" w:cs="Consolas"/>
+          <w:sz w:val="20"/>
+          <w:szCs w:val="20"/>
+        </w:rPr>
+        <w:t xml:space="preserve"> with </w:t>
+      </w:r>
+      <w:proofErr w:type="spellStart"/>
+      <w:r>
+        <w:rPr>
+          <w:rFonts w:ascii="Consolas" w:hAnsi="Consolas" w:cs="Consolas"/>
+          <w:sz w:val="20"/>
+          <w:szCs w:val="20"/>
+          <w:highlight w:val="lightGray"/>
+        </w:rPr>
+        <w:t>main</w:t>
+      </w:r>
+      <w:r>
+        <w:rPr>
+          <w:rFonts w:ascii="Consolas" w:hAnsi="Consolas" w:cs="Consolas"/>
+          <w:sz w:val="20"/>
+          <w:szCs w:val="20"/>
+        </w:rPr>
+        <w:t xml:space="preserve"> </w:t>
+      </w:r>
+      <w:r>
+        <w:rPr>
+          <w:rFonts w:cs="Consolas"/>
+        </w:rPr>
+        <w:t>br</w:t>
+      </w:r>
+      <w:proofErr w:type="spellEnd"/>
+      <w:r>
+        <w:rPr>
+          <w:rFonts w:cs="Consolas"/>
+        </w:rPr>
+        <w:t>anch.</w:t>
+      </w:r>
+      <w:r>
+        <w:rPr>
+          <w:rFonts w:ascii="Consolas" w:hAnsi="Consolas" w:cs="Consolas"/>
+        </w:rPr>
+        <w:t xml:space="preserve"> </w:t>
+      </w:r>
+    </w:p>
+    <w:p>
+      <w:pPr>
+        <w:pStyle w:val="ListParagraph"/>
+        <w:numPr>
+          <w:ilvl w:val="0"/>
+          <w:numId w:val="11"/>
+        </w:numPr>
+        <w:jc w:val="both"/>
+      </w:pPr>
+      <w:r>
+        <w:t xml:space="preserve">Once the merge is complete, pull the new main branch to your local repo to reflect the changes. This must include the </w:t>
+      </w:r>
+      <w:r>
+        <w:rPr>
+          <w:rFonts w:ascii="Consolas" w:hAnsi="Consolas" w:cs="Consolas"/>
+          <w:sz w:val="20"/>
+          <w:szCs w:val="20"/>
+          <w:highlight w:val="lightGray"/>
+        </w:rPr>
+        <w:t>--prune</w:t>
+      </w:r>
+      <w:r>
+        <w:t xml:space="preserve"> option, which removes the branch tracking for the feature branch. </w:t>
+      </w:r>
+    </w:p>
+    <w:p>
+      <w:pPr>
+        <w:pStyle w:val="ListParagraph"/>
+        <w:numPr>
+          <w:ilvl w:val="1"/>
+          <w:numId w:val="11"/>
+        </w:numPr>
+        <w:jc w:val="both"/>
+      </w:pPr>
+      <w:r>
+        <w:t>Switch</w:t>
+      </w:r>
+      <w:r>
+        <w:t xml:space="preserve"> to “main”: </w:t>
+      </w:r>
+      <w:r>
+        <w:rPr>
+          <w:rFonts w:ascii="Consolas" w:hAnsi="Consolas" w:cs="Consolas"/>
+          <w:sz w:val="20"/>
+          <w:szCs w:val="20"/>
+          <w:highlight w:val="lightGray"/>
+        </w:rPr>
+        <w:t>git checkout main</w:t>
+      </w:r>
+    </w:p>
+    <w:p>
+      <w:pPr>
+        <w:pStyle w:val="ListParagraph"/>
+        <w:numPr>
+          <w:ilvl w:val="1"/>
+          <w:numId w:val="11"/>
+        </w:numPr>
+        <w:jc w:val="both"/>
+      </w:pPr>
+      <w:r>
+        <w:t xml:space="preserve">Now, </w:t>
+      </w:r>
+      <w:r>
+        <w:rPr>
+          <w:b/>
+          <w:bCs/>
+        </w:rPr>
+        <w:t>pull</w:t>
+      </w:r>
+      <w:r>
+        <w:t xml:space="preserve"> from remote repository: </w:t>
+      </w:r>
+      <w:r>
+        <w:rPr>
+          <w:rFonts w:ascii="Consolas" w:hAnsi="Consolas" w:cs="Consolas"/>
+          <w:sz w:val="20"/>
+          <w:szCs w:val="20"/>
+          <w:highlight w:val="lightGray"/>
+        </w:rPr>
+        <w:t>git pull origin mai</w:t>
+      </w:r>
+      <w:r>
+        <w:rPr>
+          <w:rFonts w:ascii="Consolas" w:hAnsi="Consolas" w:cs="Consolas"/>
+          <w:sz w:val="20"/>
+          <w:szCs w:val="20"/>
+          <w:highlight w:val="lightGray"/>
+        </w:rPr>
+        <w:t>n</w:t>
+      </w:r>
+      <w:r>
+        <w:rPr>
+          <w:rFonts w:ascii="Consolas" w:hAnsi="Consolas" w:cs="Consolas"/>
+          <w:sz w:val="20"/>
+          <w:szCs w:val="20"/>
+          <w:highlight w:val="lightGray"/>
+        </w:rPr>
+        <w:t xml:space="preserve"> </w:t>
+      </w:r>
+      <w:r>
+        <w:rPr>
+          <w:rFonts w:ascii="Consolas" w:hAnsi="Consolas" w:cs="Consolas"/>
+          <w:sz w:val="20"/>
+          <w:szCs w:val="20"/>
+          <w:highlight w:val="lightGray"/>
+        </w:rPr>
+        <w:t>--</w:t>
+      </w:r>
+      <w:r>
+        <w:rPr>
+          <w:rFonts w:ascii="Consolas" w:hAnsi="Consolas" w:cs="Consolas"/>
+          <w:sz w:val="20"/>
+          <w:szCs w:val="20"/>
+          <w:highlight w:val="lightGray"/>
+        </w:rPr>
+        <w:t>prune</w:t>
+      </w:r>
+    </w:p>
+    <w:p>
+      <w:pPr>
+        <w:pStyle w:val="ListParagraph"/>
+        <w:numPr>
+          <w:ilvl w:val="0"/>
+          <w:numId w:val="11"/>
+        </w:numPr>
+        <w:jc w:val="both"/>
+      </w:pPr>
+      <w:r>
+        <w:rPr>
+          <w:b/>
+          <w:bCs/>
+        </w:rPr>
+        <w:t>Delete</w:t>
+      </w:r>
+      <w:r>
+        <w:t xml:space="preserve"> the feature branch </w:t>
+      </w:r>
+      <w:proofErr w:type="spellStart"/>
+      <w:r>
+        <w:rPr>
+          <w:rFonts w:ascii="Consolas" w:hAnsi="Consolas" w:cs="Consolas"/>
+          <w:sz w:val="20"/>
+          <w:szCs w:val="20"/>
+          <w:highlight w:val="lightGray"/>
+        </w:rPr>
+        <w:t>RelPerm_bug_fix</w:t>
+      </w:r>
+      <w:proofErr w:type="spellEnd"/>
+      <w:r>
+        <w:rPr>
+          <w:rFonts w:ascii="Consolas" w:hAnsi="Consolas" w:cs="Consolas"/>
+          <w:sz w:val="20"/>
+          <w:szCs w:val="20"/>
+        </w:rPr>
+        <w:t xml:space="preserve"> </w:t>
+      </w:r>
+      <w:r>
+        <w:rPr>
+          <w:rFonts w:cs="Consolas"/>
+        </w:rPr>
+        <w:t>locally.</w:t>
+      </w:r>
+      <w:r>
+        <w:rPr>
+          <w:rFonts w:ascii="Consolas" w:hAnsi="Consolas" w:cs="Consolas"/>
+          <w:sz w:val="20"/>
+          <w:szCs w:val="20"/>
+        </w:rPr>
+        <w:t xml:space="preserve"> </w:t>
+      </w:r>
+    </w:p>
+    <w:p>
+      <w:pPr>
+        <w:pStyle w:val="ListParagraph"/>
+        <w:numPr>
+          <w:ilvl w:val="1"/>
+          <w:numId w:val="11"/>
+        </w:numPr>
+        <w:jc w:val="both"/>
+        <w:rPr>
+          <w:rFonts w:cstheme="majorHAnsi"/>
+        </w:rPr>
+      </w:pPr>
+      <w:r>
+        <w:rPr>
+          <w:rFonts w:cstheme="majorHAnsi"/>
+        </w:rPr>
+        <w:t xml:space="preserve">Try </w:t>
+      </w:r>
+      <w:r>
+        <w:rPr>
+          <w:rFonts w:ascii="Consolas" w:hAnsi="Consolas" w:cs="Consolas"/>
+          <w:sz w:val="20"/>
+          <w:szCs w:val="20"/>
+          <w:highlight w:val="lightGray"/>
+        </w:rPr>
+        <w:t xml:space="preserve">git branch -d </w:t>
+      </w:r>
+      <w:proofErr w:type="spellStart"/>
+      <w:r>
+        <w:rPr>
+          <w:rFonts w:ascii="Consolas" w:hAnsi="Consolas" w:cs="Consolas"/>
+          <w:sz w:val="20"/>
+          <w:szCs w:val="20"/>
+          <w:highlight w:val="lightGray"/>
+        </w:rPr>
+        <w:t>RelPerm_bug_fix</w:t>
+      </w:r>
+      <w:proofErr w:type="spellEnd"/>
+      <w:r>
+        <w:rPr>
+          <w:rFonts w:cs="Consolas"/>
+          <w:sz w:val="20"/>
+          <w:szCs w:val="20"/>
+        </w:rPr>
+        <w:t xml:space="preserve">. </w:t>
+      </w:r>
+    </w:p>
+    <w:p>
+      <w:pPr>
+        <w:pStyle w:val="ListParagraph"/>
+        <w:numPr>
+          <w:ilvl w:val="1"/>
+          <w:numId w:val="11"/>
+        </w:numPr>
+        <w:jc w:val="both"/>
+        <w:rPr>
+          <w:rFonts w:cstheme="majorHAnsi"/>
+        </w:rPr>
+      </w:pPr>
+      <w:r>
+        <w:rPr>
+          <w:rFonts w:cs="Consolas"/>
+        </w:rPr>
+        <w:t xml:space="preserve">If merge was performed as a “squash” merge (meaning all commits in the feature branch were squashed into a single commit in the main branch), </w:t>
+      </w:r>
+      <w:proofErr w:type="gramStart"/>
+      <w:r>
+        <w:rPr>
+          <w:rFonts w:cs="Consolas"/>
+        </w:rPr>
+        <w:t>the you</w:t>
+      </w:r>
+      <w:proofErr w:type="gramEnd"/>
+      <w:r>
+        <w:rPr>
+          <w:rFonts w:cs="Consolas"/>
+        </w:rPr>
+        <w:t xml:space="preserve"> need to force the delete with </w:t>
+      </w:r>
+      <w:r>
+        <w:rPr>
+          <w:rFonts w:ascii="Consolas" w:hAnsi="Consolas" w:cs="Consolas"/>
+          <w:sz w:val="20"/>
+          <w:szCs w:val="20"/>
+          <w:highlight w:val="lightGray"/>
+        </w:rPr>
+        <w:t>git branch -</w:t>
+      </w:r>
+      <w:r>
+        <w:rPr>
+          <w:rFonts w:ascii="Consolas" w:hAnsi="Consolas" w:cs="Consolas"/>
+          <w:sz w:val="20"/>
+          <w:szCs w:val="20"/>
+          <w:highlight w:val="lightGray"/>
+        </w:rPr>
+        <w:t>D</w:t>
+      </w:r>
+      <w:r>
+        <w:rPr>
+          <w:rFonts w:ascii="Consolas" w:hAnsi="Consolas" w:cs="Consolas"/>
+          <w:sz w:val="20"/>
+          <w:szCs w:val="20"/>
+          <w:highlight w:val="lightGray"/>
+        </w:rPr>
+        <w:t xml:space="preserve"> </w:t>
+      </w:r>
+      <w:proofErr w:type="spellStart"/>
+      <w:r>
+        <w:rPr>
+          <w:rFonts w:ascii="Consolas" w:hAnsi="Consolas" w:cs="Consolas"/>
+          <w:sz w:val="20"/>
+          <w:szCs w:val="20"/>
+          <w:highlight w:val="lightGray"/>
+        </w:rPr>
+        <w:t>RelPerm_bug_fix</w:t>
+      </w:r>
+      <w:proofErr w:type="spellEnd"/>
+      <w:r>
+        <w:rPr>
+          <w:rFonts w:cs="Consolas"/>
+          <w:sz w:val="20"/>
+          <w:szCs w:val="20"/>
+        </w:rPr>
+        <w:t>.</w:t>
+      </w:r>
+    </w:p>
+    <w:p>
+      <w:pPr>
         <w:pStyle w:val="Heading1"/>
         <w:jc w:val="both"/>
       </w:pPr>
@@ -2436,15 +2773,7 @@
         <w:jc w:val="both"/>
       </w:pPr>
       <w:r>
-        <w:t xml:space="preserve">The integration tests included with </w:t>
-      </w:r>
-      <w:proofErr w:type="spellStart"/>
-      <w:r>
-        <w:t>DARSim</w:t>
-      </w:r>
-      <w:proofErr w:type="spellEnd"/>
-      <w:r>
-        <w:t xml:space="preserve"> are summarized in Table 1. These tests are very small and simple allowing them to perform very quickly. They </w:t>
+        <w:t xml:space="preserve">The integration tests included with DARSim are summarized in Table 1. These tests are very small and simple allowing them to perform very quickly. They </w:t>
       </w:r>
       <w:r>
         <w:rPr>
@@ -2453,31 +2782,7 @@
         <w:t>do not test all</w:t>
       </w:r>
       <w:r>
-        <w:t xml:space="preserve"> </w:t>
-      </w:r>
-      <w:proofErr w:type="spellStart"/>
-      <w:r>
-        <w:t>DARSim’s</w:t>
-      </w:r>
-      <w:proofErr w:type="spellEnd"/>
-      <w:r>
-        <w:t xml:space="preserve"> capabilities and do not guarantee that a new feature branch of </w:t>
-      </w:r>
-      <w:proofErr w:type="spellStart"/>
-      <w:r>
-        <w:t>DARSim</w:t>
-      </w:r>
-      <w:proofErr w:type="spellEnd"/>
-      <w:r>
-        <w:t xml:space="preserve"> is bug free. They simply provide a quick assessment of </w:t>
-      </w:r>
-      <w:proofErr w:type="spellStart"/>
-      <w:r>
-        <w:t>DARSim’s</w:t>
-      </w:r>
-      <w:proofErr w:type="spellEnd"/>
-      <w:r>
-        <w:t xml:space="preserve"> basic functionality to provide at least </w:t>
+        <w:t xml:space="preserve"> DARSim’s capabilities and do not guarantee that a new feature branch of DARSim is bug free. They simply provide a quick assessment of DARSim’s basic functionality to provide at least </w:t>
       </w:r>
       <w:r>
         <w:rPr>
@@ -8564,7 +8869,7 @@
         <w:ind w:left="1800" w:hanging="180"/>
       </w:pPr>
     </w:lvl>
-    <w:lvl w:ilvl="3" w:tplc="0409000F" w:tentative="1">
+    <w:lvl w:ilvl="3" w:tplc="0409000F">
       <w:start w:val="1"/>
       <w:numFmt w:val="decimal"/>
       <w:lvlText w:val="%4."/>

</xml_diff>

<commit_message>
Update to developer's guide for git fetch command
</commit_message>
<xml_diff>
--- a/Documentation/Developers_Guide.docx
+++ b/Documentation/Developers_Guide.docx
@@ -1,6 +1,6 @@
 
 <file path=word/document.xml><?xml version="1.0" encoding="utf-8"?>
-<w:document xmlns:wpc="http://schemas.microsoft.com/office/word/2010/wordprocessingCanvas" xmlns:cx="http://schemas.microsoft.com/office/drawing/2014/chartex" xmlns:cx1="http://schemas.microsoft.com/office/drawing/2015/9/8/chartex" xmlns:cx2="http://schemas.microsoft.com/office/drawing/2015/10/21/chartex" xmlns:cx3="http://schemas.microsoft.com/office/drawing/2016/5/9/chartex" xmlns:cx4="http://schemas.microsoft.com/office/drawing/2016/5/10/chartex" xmlns:cx5="http://schemas.microsoft.com/office/drawing/2016/5/11/chartex" xmlns:cx6="http://schemas.microsoft.com/office/drawing/2016/5/12/chartex" xmlns:cx7="http://schemas.microsoft.com/office/drawing/2016/5/13/chartex" xmlns:cx8="http://schemas.microsoft.com/office/drawing/2016/5/14/chartex" xmlns:mc="http://schemas.openxmlformats.org/markup-compatibility/2006" xmlns:m="http://schemas.openxmlformats.org/officeDocument/2006/math" xmlns:aink="http://schemas.microsoft.com/office/drawing/2016/ink" xmlns:am3d="http://schemas.microsoft.com/office/drawing/2017/model3d" xmlns:oel="http://schemas.microsoft.com/office/2019/extlst" xmlns:r="http://schemas.openxmlformats.org/officeDocument/2006/relationships" xmlns:wp14="http://schemas.microsoft.com/office/word/2010/wordprocessingDrawing" xmlns:wp="http://schemas.openxmlformats.org/drawingml/2006/wordprocessingDrawing" xmlns:wpg="http://schemas.microsoft.com/office/word/2010/wordprocessingGroup" xmlns:wpi="http://schemas.microsoft.com/office/word/2010/wordprocessingInk" xmlns:wps="http://schemas.microsoft.com/office/word/2010/wordprocessingShape" xmlns:o="urn:schemas-microsoft-com:office:office" xmlns:v="urn:schemas-microsoft-com:vml" xmlns:w10="urn:schemas-microsoft-com:office:word" xmlns:w="http://schemas.openxmlformats.org/wordprocessingml/2006/main" xmlns:w14="http://schemas.microsoft.com/office/word/2010/wordml" xmlns:w15="http://schemas.microsoft.com/office/word/2012/wordml" xmlns:w16cex="http://schemas.microsoft.com/office/word/2018/wordml/cex" xmlns:w16cid="http://schemas.microsoft.com/office/word/2016/wordml/cid" xmlns:w16="http://schemas.microsoft.com/office/word/2018/wordml" xmlns:w16sdtdh="http://schemas.microsoft.com/office/word/2020/wordml/sdtdatahash" xmlns:w16sdtfl="http://schemas.microsoft.com/office/word/2024/wordml/sdtformatlock" xmlns:w16se="http://schemas.microsoft.com/office/word/2015/wordml/symex" xmlns:w16du="http://schemas.microsoft.com/office/word/2023/wordml/word16du" xmlns:wne="http://schemas.microsoft.com/office/word/2006/wordml" mc:Ignorable="w14 w15 w16se w16cid w16 w16cex w16sdtdh w16sdtfl w16du wp14">
+<w:document xmlns:wpc="http://schemas.microsoft.com/office/word/2010/wordprocessingCanvas" xmlns:cx="http://schemas.microsoft.com/office/drawing/2014/chartex" xmlns:cx1="http://schemas.microsoft.com/office/drawing/2015/9/8/chartex" xmlns:cx2="http://schemas.microsoft.com/office/drawing/2015/10/21/chartex" xmlns:cx3="http://schemas.microsoft.com/office/drawing/2016/5/9/chartex" xmlns:cx4="http://schemas.microsoft.com/office/drawing/2016/5/10/chartex" xmlns:cx5="http://schemas.microsoft.com/office/drawing/2016/5/11/chartex" xmlns:cx6="http://schemas.microsoft.com/office/drawing/2016/5/12/chartex" xmlns:cx7="http://schemas.microsoft.com/office/drawing/2016/5/13/chartex" xmlns:cx8="http://schemas.microsoft.com/office/drawing/2016/5/14/chartex" xmlns:mc="http://schemas.openxmlformats.org/markup-compatibility/2006" xmlns:m="http://schemas.openxmlformats.org/officeDocument/2006/math" xmlns:aink="http://schemas.microsoft.com/office/drawing/2016/ink" xmlns:am3d="http://schemas.microsoft.com/office/drawing/2017/model3d" xmlns:oel="http://schemas.microsoft.com/office/2019/extlst" xmlns:r="http://schemas.openxmlformats.org/officeDocument/2006/relationships" xmlns:wp14="http://schemas.microsoft.com/office/word/2010/wordprocessingDrawing" xmlns:wp="http://schemas.openxmlformats.org/drawingml/2006/wordprocessingDrawing" xmlns:wpg="http://schemas.microsoft.com/office/word/2010/wordprocessingGroup" xmlns:wpi="http://schemas.microsoft.com/office/word/2010/wordprocessingInk" xmlns:wps="http://schemas.microsoft.com/office/word/2010/wordprocessingShape" xmlns:o="urn:schemas-microsoft-com:office:office" xmlns:v="urn:schemas-microsoft-com:vml" xmlns:w10="urn:schemas-microsoft-com:office:word" xmlns:w="http://schemas.openxmlformats.org/wordprocessingml/2006/main" xmlns:w14="http://schemas.microsoft.com/office/word/2010/wordml" xmlns:w15="http://schemas.microsoft.com/office/word/2012/wordml" xmlns:w16cei="http://schemas.microsoft.com/office/word/2026/wordml/cei" xmlns:w16cex="http://schemas.microsoft.com/office/word/2018/wordml/cex" xmlns:w16cid="http://schemas.microsoft.com/office/word/2016/wordml/cid" xmlns:w16="http://schemas.microsoft.com/office/word/2018/wordml" xmlns:w16sdtdh="http://schemas.microsoft.com/office/word/2020/wordml/sdtdatahash" xmlns:w16sdtfl="http://schemas.microsoft.com/office/word/2024/wordml/sdtformatlock" xmlns:w16se="http://schemas.microsoft.com/office/word/2015/wordml/symex" xmlns:w16du="http://schemas.microsoft.com/office/word/2023/wordml/word16du" xmlns:wne="http://schemas.microsoft.com/office/word/2006/wordml" mc:Ignorable="w14 w15 w16se w16cid w16 w16cex w16sdtdh w16sdtfl w16du wp14">
   <w:body>
     <w:p>
       <w:pPr>
@@ -1765,13 +1765,80 @@
         <w:jc w:val="both"/>
       </w:pPr>
       <w:r>
-        <w:t xml:space="preserve">Now your colleague can </w:t>
-      </w:r>
-      <w:r>
-        <w:t>pull</w:t>
-      </w:r>
-      <w:r>
-        <w:t xml:space="preserve"> the feature branch, make edits on their computer, and push them back to GitLab when they are done. </w:t>
+        <w:t xml:space="preserve">Now your colleague can grab the feature branch: </w:t>
+      </w:r>
+      <w:r>
+        <w:rPr>
+          <w:rFonts w:ascii="Consolas" w:hAnsi="Consolas" w:cs="Consolas"/>
+          <w:sz w:val="20"/>
+          <w:szCs w:val="20"/>
+          <w:highlight w:val="lightGray"/>
+        </w:rPr>
+        <w:t>git fetch origin</w:t>
+      </w:r>
+      <w:r>
+        <w:t xml:space="preserve">, then </w:t>
+      </w:r>
+      <w:r>
+        <w:rPr>
+          <w:rFonts w:ascii="Consolas" w:hAnsi="Consolas" w:cs="Consolas"/>
+          <w:sz w:val="20"/>
+          <w:szCs w:val="20"/>
+          <w:highlight w:val="lightGray"/>
+        </w:rPr>
+        <w:t xml:space="preserve">git checkout -b </w:t>
+      </w:r>
+      <w:proofErr w:type="spellStart"/>
+      <w:r>
+        <w:rPr>
+          <w:rFonts w:ascii="Consolas" w:hAnsi="Consolas" w:cs="Consolas"/>
+          <w:sz w:val="20"/>
+          <w:szCs w:val="20"/>
+          <w:highlight w:val="lightGray"/>
+        </w:rPr>
+        <w:t>RelPerm_bug_fix</w:t>
+      </w:r>
+      <w:proofErr w:type="spellEnd"/>
+      <w:r>
+        <w:rPr>
+          <w:rFonts w:ascii="Consolas" w:hAnsi="Consolas" w:cs="Consolas"/>
+          <w:sz w:val="20"/>
+          <w:szCs w:val="20"/>
+          <w:highlight w:val="lightGray"/>
+        </w:rPr>
+        <w:t xml:space="preserve"> origin/</w:t>
+      </w:r>
+      <w:proofErr w:type="spellStart"/>
+      <w:r>
+        <w:rPr>
+          <w:rFonts w:ascii="Consolas" w:hAnsi="Consolas" w:cs="Consolas"/>
+          <w:sz w:val="20"/>
+          <w:szCs w:val="20"/>
+          <w:highlight w:val="lightGray"/>
+        </w:rPr>
+        <w:t>RelPerm_bug_fix</w:t>
+      </w:r>
+      <w:proofErr w:type="spellEnd"/>
+      <w:r>
+        <w:rPr>
+          <w:rFonts w:ascii="Menlo" w:hAnsi="Menlo" w:cs="Menlo"/>
+          <w:sz w:val="20"/>
+          <w:szCs w:val="20"/>
+        </w:rPr>
+        <w:t xml:space="preserve"> </w:t>
+      </w:r>
+    </w:p>
+    <w:p>
+      <w:pPr>
+        <w:pStyle w:val="ListParagraph"/>
+        <w:numPr>
+          <w:ilvl w:val="1"/>
+          <w:numId w:val="11"/>
+        </w:numPr>
+        <w:jc w:val="both"/>
+      </w:pPr>
+      <w:r>
+        <w:t xml:space="preserve">Your colleague can make edits on their computer and push them back to GitLab when they are done. </w:t>
       </w:r>
     </w:p>
     <w:p>
@@ -1784,7 +1851,7 @@
         <w:jc w:val="both"/>
       </w:pPr>
       <w:r>
-        <w:t xml:space="preserve"> Now you need to grab your colleagues edits before finishing your work. Do this with another </w:t>
+        <w:t xml:space="preserve">Now you need to grab your colleagues edits before finishing your work. Do this with another </w:t>
       </w:r>
       <w:r>
         <w:rPr>
@@ -2020,6 +2087,7 @@
         <w:jc w:val="both"/>
       </w:pPr>
       <w:r>
+        <w:lastRenderedPageBreak/>
         <w:t xml:space="preserve">Make your </w:t>
       </w:r>
       <w:r>
@@ -2123,7 +2191,6 @@
         <w:jc w:val="both"/>
       </w:pPr>
       <w:r>
-        <w:lastRenderedPageBreak/>
         <w:t>You should see “nothing to commit, working tree clean”</w:t>
       </w:r>
     </w:p>
@@ -2373,7 +2440,6 @@
         </w:rPr>
         <w:t xml:space="preserve"> with </w:t>
       </w:r>
-      <w:proofErr w:type="spellStart"/>
       <w:r>
         <w:rPr>
           <w:rFonts w:ascii="Consolas" w:hAnsi="Consolas" w:cs="Consolas"/>
@@ -2395,14 +2461,7 @@
         <w:rPr>
           <w:rFonts w:cs="Consolas"/>
         </w:rPr>
-        <w:t>br</w:t>
-      </w:r>
-      <w:proofErr w:type="spellEnd"/>
-      <w:r>
-        <w:rPr>
-          <w:rFonts w:cs="Consolas"/>
-        </w:rPr>
-        <w:t>anch.</w:t>
+        <w:t>branch.</w:t>
       </w:r>
       <w:r>
         <w:rPr>
@@ -2446,10 +2505,7 @@
         <w:jc w:val="both"/>
       </w:pPr>
       <w:r>
-        <w:t>Switch</w:t>
-      </w:r>
-      <w:r>
-        <w:t xml:space="preserve"> to “main”: </w:t>
+        <w:t xml:space="preserve">Switch to “main”: </w:t>
       </w:r>
       <w:r>
         <w:rPr>
@@ -2499,16 +2555,7 @@
           <w:szCs w:val="20"/>
           <w:highlight w:val="lightGray"/>
         </w:rPr>
-        <w:t>n</w:t>
-      </w:r>
-      <w:r>
-        <w:rPr>
-          <w:rFonts w:ascii="Consolas" w:hAnsi="Consolas" w:cs="Consolas"/>
-          <w:sz w:val="20"/>
-          <w:szCs w:val="20"/>
-          <w:highlight w:val="lightGray"/>
-        </w:rPr>
-        <w:t xml:space="preserve"> </w:t>
+        <w:t xml:space="preserve">n </w:t>
       </w:r>
       <w:r>
         <w:rPr>
@@ -8289,7 +8336,7 @@
 </file>
 
 <file path=word/numbering.xml><?xml version="1.0" encoding="utf-8"?>
-<w:numbering xmlns:wpc="http://schemas.microsoft.com/office/word/2010/wordprocessingCanvas" xmlns:cx="http://schemas.microsoft.com/office/drawing/2014/chartex" xmlns:cx1="http://schemas.microsoft.com/office/drawing/2015/9/8/chartex" xmlns:cx2="http://schemas.microsoft.com/office/drawing/2015/10/21/chartex" xmlns:cx3="http://schemas.microsoft.com/office/drawing/2016/5/9/chartex" xmlns:cx4="http://schemas.microsoft.com/office/drawing/2016/5/10/chartex" xmlns:cx5="http://schemas.microsoft.com/office/drawing/2016/5/11/chartex" xmlns:cx6="http://schemas.microsoft.com/office/drawing/2016/5/12/chartex" xmlns:cx7="http://schemas.microsoft.com/office/drawing/2016/5/13/chartex" xmlns:cx8="http://schemas.microsoft.com/office/drawing/2016/5/14/chartex" xmlns:mc="http://schemas.openxmlformats.org/markup-compatibility/2006" xmlns:m="http://schemas.openxmlformats.org/officeDocument/2006/math" xmlns:aink="http://schemas.microsoft.com/office/drawing/2016/ink" xmlns:am3d="http://schemas.microsoft.com/office/drawing/2017/model3d" xmlns:oel="http://schemas.microsoft.com/office/2019/extlst" xmlns:r="http://schemas.openxmlformats.org/officeDocument/2006/relationships" xmlns:wp14="http://schemas.microsoft.com/office/word/2010/wordprocessingDrawing" xmlns:wp="http://schemas.openxmlformats.org/drawingml/2006/wordprocessingDrawing" xmlns:wpg="http://schemas.microsoft.com/office/word/2010/wordprocessingGroup" xmlns:wpi="http://schemas.microsoft.com/office/word/2010/wordprocessingInk" xmlns:wps="http://schemas.microsoft.com/office/word/2010/wordprocessingShape" xmlns:o="urn:schemas-microsoft-com:office:office" xmlns:v="urn:schemas-microsoft-com:vml" xmlns:w10="urn:schemas-microsoft-com:office:word" xmlns:w="http://schemas.openxmlformats.org/wordprocessingml/2006/main" xmlns:w14="http://schemas.microsoft.com/office/word/2010/wordml" xmlns:w15="http://schemas.microsoft.com/office/word/2012/wordml" xmlns:w16cex="http://schemas.microsoft.com/office/word/2018/wordml/cex" xmlns:w16cid="http://schemas.microsoft.com/office/word/2016/wordml/cid" xmlns:w16="http://schemas.microsoft.com/office/word/2018/wordml" xmlns:w16sdtdh="http://schemas.microsoft.com/office/word/2020/wordml/sdtdatahash" xmlns:w16sdtfl="http://schemas.microsoft.com/office/word/2024/wordml/sdtformatlock" xmlns:w16se="http://schemas.microsoft.com/office/word/2015/wordml/symex" xmlns:w16du="http://schemas.microsoft.com/office/word/2023/wordml/word16du" xmlns:wne="http://schemas.microsoft.com/office/word/2006/wordml" mc:Ignorable="w14 w15 w16se w16cid w16 w16cex w16sdtdh w16sdtfl w16du wp14">
+<w:numbering xmlns:wpc="http://schemas.microsoft.com/office/word/2010/wordprocessingCanvas" xmlns:cx="http://schemas.microsoft.com/office/drawing/2014/chartex" xmlns:cx1="http://schemas.microsoft.com/office/drawing/2015/9/8/chartex" xmlns:cx2="http://schemas.microsoft.com/office/drawing/2015/10/21/chartex" xmlns:cx3="http://schemas.microsoft.com/office/drawing/2016/5/9/chartex" xmlns:cx4="http://schemas.microsoft.com/office/drawing/2016/5/10/chartex" xmlns:cx5="http://schemas.microsoft.com/office/drawing/2016/5/11/chartex" xmlns:cx6="http://schemas.microsoft.com/office/drawing/2016/5/12/chartex" xmlns:cx7="http://schemas.microsoft.com/office/drawing/2016/5/13/chartex" xmlns:cx8="http://schemas.microsoft.com/office/drawing/2016/5/14/chartex" xmlns:mc="http://schemas.openxmlformats.org/markup-compatibility/2006" xmlns:m="http://schemas.openxmlformats.org/officeDocument/2006/math" xmlns:aink="http://schemas.microsoft.com/office/drawing/2016/ink" xmlns:am3d="http://schemas.microsoft.com/office/drawing/2017/model3d" xmlns:oel="http://schemas.microsoft.com/office/2019/extlst" xmlns:r="http://schemas.openxmlformats.org/officeDocument/2006/relationships" xmlns:wp14="http://schemas.microsoft.com/office/word/2010/wordprocessingDrawing" xmlns:wp="http://schemas.openxmlformats.org/drawingml/2006/wordprocessingDrawing" xmlns:wpg="http://schemas.microsoft.com/office/word/2010/wordprocessingGroup" xmlns:wpi="http://schemas.microsoft.com/office/word/2010/wordprocessingInk" xmlns:wps="http://schemas.microsoft.com/office/word/2010/wordprocessingShape" xmlns:o="urn:schemas-microsoft-com:office:office" xmlns:v="urn:schemas-microsoft-com:vml" xmlns:w10="urn:schemas-microsoft-com:office:word" xmlns:w="http://schemas.openxmlformats.org/wordprocessingml/2006/main" xmlns:w14="http://schemas.microsoft.com/office/word/2010/wordml" xmlns:w15="http://schemas.microsoft.com/office/word/2012/wordml" xmlns:w16cei="http://schemas.microsoft.com/office/word/2026/wordml/cei" xmlns:w16cex="http://schemas.microsoft.com/office/word/2018/wordml/cex" xmlns:w16cid="http://schemas.microsoft.com/office/word/2016/wordml/cid" xmlns:w16="http://schemas.microsoft.com/office/word/2018/wordml" xmlns:w16sdtdh="http://schemas.microsoft.com/office/word/2020/wordml/sdtdatahash" xmlns:w16sdtfl="http://schemas.microsoft.com/office/word/2024/wordml/sdtformatlock" xmlns:w16se="http://schemas.microsoft.com/office/word/2015/wordml/symex" xmlns:w16du="http://schemas.microsoft.com/office/word/2023/wordml/word16du" xmlns:wne="http://schemas.microsoft.com/office/word/2006/wordml" mc:Ignorable="w14 w15 w16se w16cid w16 w16cex w16sdtdh w16sdtfl w16du wp14">
   <w:abstractNum w:abstractNumId="0" w15:restartNumberingAfterBreak="0">
     <w:nsid w:val="FFFFFF7C"/>
     <w:multiLevelType w:val="singleLevel"/>

</xml_diff>